<commit_message>
terminado ahora me parece
</commit_message>
<xml_diff>
--- a/Taller/Archivos notables/Desafio3_Documento_Mejorado.docx
+++ b/Taller/Archivos notables/Desafio3_Documento_Mejorado.docx
@@ -2710,7 +2710,19 @@
         <w:rPr>
           <w:lang w:val="es-UY"/>
         </w:rPr>
-        <w:t>CONTEXTO: Marzo funciona como el mes preparatorio para el Año Nuevo birmano (Thingyan, 13-16 abril), período tradicionalmente asociado con renovación, limpieza y nuevos proyectos familiares. Durante este tiempo, las familias birmanas invierten en mejorar sus hogares y planificar actividades que fortalezcan los vínculos familiares.</w:t>
+        <w:t xml:space="preserve">CONTEXTO: Marzo funciona como el mes preparatorio para el Año Nuevo birmano </w:t>
+      </w:r>
+      <w:r>
+        <w:rPr>
+          <w:lang w:val="es-UY"/>
+        </w:rPr>
+        <w:t>**</w:t>
+      </w:r>
+      <w:r>
+        <w:rPr>
+          <w:lang w:val="es-UY"/>
+        </w:rPr>
+        <w:t>(Thingyan, 13-16 abril), período tradicionalmente asociado con renovación, limpieza y nuevos proyectos familiares. Durante este tiempo, las familias birmanas invierten en mejorar sus hogares y planificar actividades que fortalezcan los vínculos familiares.</w:t>
       </w:r>
     </w:p>
     <w:p>
@@ -2751,6 +2763,25 @@
           <w:lang w:val="es-UY"/>
         </w:rPr>
         <w:t>POR QUÉ: La estrategia capitaliza el contexto cultural birmano donde marzo es el mes de preparación para las celebraciones más importantes del año. Yangon concentra el mayor ticket promedio en estas categorías, y la proximidad del Año Nuevo genera una demanda natural por productos que mejoren tanto el hogar como las experiencias familiares, creando sinergias comerciales entre líneas de productos tradicionalmente separadas.</w:t>
+      </w:r>
+    </w:p>
+    <w:p>
+      <w:pPr>
+        <w:rPr>
+          <w:lang w:val="es-UY"/>
+        </w:rPr>
+      </w:pPr>
+      <w:r>
+        <w:rPr>
+          <w:lang w:val="es-UY"/>
+        </w:rPr>
+        <w:t xml:space="preserve">**Fuente: </w:t>
+      </w:r>
+      <w:r>
+        <w:rPr>
+          <w:lang w:val="es-UY"/>
+        </w:rPr>
+        <w:t>https://www.colaborabirmania.org/el-ano-nuevo-budista-en-tailandia-y-myanmar/#:~:text=Se%20celebra%20en%20abril%2C%20generalmente%20del%2013,en%20un%20ambiente%20de%20celebraci%C3%B3n%20y%20unidad.</w:t>
       </w:r>
       <w:r>
         <w:rPr>
@@ -3331,7 +3362,14 @@
           <w:b/>
           <w:lang w:val="es-UY"/>
         </w:rPr>
-        <w:t>Elemento destacado: El insight clave "En Health &amp; Beauty, los hombres gastan un 65% más que las mujeres — la mayor brecha de todo el dataset" se presenta en una banda verde oscura que contrasta con el fondo claro.</w:t>
+        <w:t xml:space="preserve">Elemento destacado: </w:t>
+      </w:r>
+      <w:r>
+        <w:rPr>
+          <w:bCs/>
+          <w:lang w:val="es-UY"/>
+        </w:rPr>
+        <w:t>El insight clave "En Health &amp; Beauty, los hombres gastan un 65% más que las mujeres — la mayor brecha de todo el dataset" se presenta en una banda verde oscura que contrasta con el fondo claro.</w:t>
       </w:r>
     </w:p>
     <w:p>
@@ -3368,17 +3406,32 @@
     <w:p>
       <w:pPr>
         <w:rPr>
+          <w:bCs/>
+          <w:lang w:val="es-UY"/>
+        </w:rPr>
+      </w:pPr>
+      <w:r>
+        <w:rPr>
           <w:b/>
           <w:lang w:val="es-UY"/>
         </w:rPr>
-      </w:pPr>
-      <w:r>
+        <w:t xml:space="preserve">Color estratégico: </w:t>
+      </w:r>
+      <w:r>
+        <w:rPr>
+          <w:bCs/>
+          <w:lang w:val="es-UY"/>
+        </w:rPr>
+        <w:t>Se utilizó verde oscuro para la banda del insight, creando un contraste visual inmediato que dirige la atención del espectador hacia la información más relevante de toda la slide.</w:t>
+      </w:r>
+    </w:p>
+    <w:p>
+      <w:pPr>
         <w:rPr>
           <w:b/>
           <w:lang w:val="es-UY"/>
         </w:rPr>
-        <w:t>Color estratégico: Se utilizó verde oscuro (#2D5A3D) para la banda del insight, creando un contraste visual inmediato que dirige la atención del espectador hacia la información más relevante de toda la slide.</w:t>
-      </w:r>
+      </w:pPr>
     </w:p>
     <w:p>
       <w:pPr>
@@ -3387,29 +3440,50 @@
           <w:lang w:val="es-UY"/>
         </w:rPr>
       </w:pPr>
-    </w:p>
-    <w:p>
-      <w:pPr>
+      <w:r>
         <w:rPr>
           <w:b/>
           <w:lang w:val="es-UY"/>
         </w:rPr>
-      </w:pPr>
-      <w:r>
+        <w:t xml:space="preserve">Jerarquía visual: </w:t>
+      </w:r>
+      <w:r>
+        <w:rPr>
+          <w:bCs/>
+          <w:lang w:val="es-UY"/>
+        </w:rPr>
+        <w:t>El gráfico de barras apiladas muestra todas las categorías de productos, pero el insight textual actúa como un "spotlight" que le dice al espectador exactamente qué debe observar en los datos.</w:t>
+      </w:r>
+    </w:p>
+    <w:p>
+      <w:pPr>
         <w:rPr>
           <w:b/>
           <w:lang w:val="es-UY"/>
         </w:rPr>
-        <w:t>Jerarquía visual: El gráfico de barras apiladas muestra todas las categorías de productos, pero el insight textual actúa como un "spotlight" que le dice al espectador exactamente qué debe observar en los datos.</w:t>
-      </w:r>
-    </w:p>
-    <w:p>
-      <w:pPr>
+      </w:pPr>
+    </w:p>
+    <w:p>
+      <w:pPr>
+        <w:rPr>
+          <w:bCs/>
+          <w:lang w:val="es-UY"/>
+        </w:rPr>
+      </w:pPr>
+      <w:r>
         <w:rPr>
           <w:b/>
           <w:lang w:val="es-UY"/>
         </w:rPr>
-      </w:pPr>
+        <w:t xml:space="preserve">Eliminación de ruido: </w:t>
+      </w:r>
+      <w:r>
+        <w:rPr>
+          <w:bCs/>
+          <w:lang w:val="es-UY"/>
+        </w:rPr>
+        <w:t>Aunque el gráfico contiene múltiples categorías y dos géneros, el insight focaliza la atención específicamente en Health &amp; Beauty, evitando que el espectador se pierda analizando todas las categorías por igual.</w:t>
+      </w:r>
     </w:p>
     <w:p>
       <w:pPr>
@@ -3418,57 +3492,57 @@
           <w:lang w:val="es-UY"/>
         </w:rPr>
       </w:pPr>
+    </w:p>
+    <w:p>
+      <w:pPr>
+        <w:rPr>
+          <w:bCs/>
+          <w:lang w:val="es-UY"/>
+        </w:rPr>
+      </w:pPr>
       <w:r>
         <w:rPr>
           <w:b/>
           <w:lang w:val="es-UY"/>
         </w:rPr>
-        <w:t>Eliminación de ruido: Aunque el gráfico contiene múltiples categorías y dos géneros, el insight focaliza la atención específicamente en Health &amp; Beauty, evitando que el espectador se pierda analizando todas las categorías por igual.</w:t>
-      </w:r>
-    </w:p>
-    <w:p>
-      <w:pPr>
+        <w:t xml:space="preserve">Resultado del Foco: </w:t>
+      </w:r>
+      <w:r>
+        <w:rPr>
+          <w:bCs/>
+          <w:lang w:val="es-UY"/>
+        </w:rPr>
+        <w:t>El espectador inmediatamente comprende que, de todas las brechas de género en el portafolio de productos, Health &amp; Beauty representa la mayor oportunidad comercial, con los hombres dominando esta categoría con un 62.3% vs 37.7% de las mujeres.</w:t>
+      </w:r>
+    </w:p>
+    <w:p>
+      <w:pPr>
+        <w:rPr>
+          <w:bCs/>
+          <w:lang w:val="es-UY"/>
+        </w:rPr>
+      </w:pPr>
+    </w:p>
+    <w:p>
+      <w:pPr>
+        <w:rPr>
+          <w:bCs/>
+          <w:lang w:val="es-UY"/>
+        </w:rPr>
+      </w:pPr>
+      <w:r>
         <w:rPr>
           <w:b/>
           <w:lang w:val="es-UY"/>
         </w:rPr>
-      </w:pPr>
-    </w:p>
-    <w:p>
-      <w:pPr>
-        <w:rPr>
-          <w:b/>
-          <w:lang w:val="es-UY"/>
-        </w:rPr>
-      </w:pPr>
-      <w:r>
-        <w:rPr>
-          <w:b/>
-          <w:lang w:val="es-UY"/>
-        </w:rPr>
-        <w:t>Resultado del Foco: El espectador inmediatamente comprende que, de todas las brechas de género en el portafolio de productos, Health &amp; Beauty representa la mayor oportunidad comercial, con los hombres dominando esta categoría con un 62.3% vs 37.7% de las mujeres.</w:t>
-      </w:r>
-    </w:p>
-    <w:p>
-      <w:pPr>
-        <w:rPr>
-          <w:b/>
-          <w:lang w:val="es-UY"/>
-        </w:rPr>
-      </w:pPr>
-    </w:p>
-    <w:p>
-      <w:pPr>
-        <w:rPr>
-          <w:lang w:val="es-UY"/>
-        </w:rPr>
-      </w:pPr>
-      <w:r>
-        <w:rPr>
-          <w:b/>
-          <w:lang w:val="es-UY"/>
-        </w:rPr>
-        <w:t>Impacto en la narrativa: Esta aplicación de foco convierte un gráfico complejo con múltiples variables en un mensaje claro y accionable que fundamenta directamente la Campaña 2 (Febrero) dirigida a hombres en Health &amp; Beauty.</w:t>
+        <w:t xml:space="preserve">Impacto en la narrativa: </w:t>
+      </w:r>
+      <w:r>
+        <w:rPr>
+          <w:bCs/>
+          <w:lang w:val="es-UY"/>
+        </w:rPr>
+        <w:t>Esta aplicación de foco convierte un gráfico complejo con múltiples variables en un mensaje claro y accionable que fundamenta directamente la Campaña 2 (Febrero) dirigida a hombres en Health &amp; Beauty.</w:t>
       </w:r>
     </w:p>
     <w:sectPr>

</xml_diff>